<commit_message>
docs(revision): marcar D16 y el título como resueltos y sacar validaciones pendientes
Co-Authored-By: Claude Opus 5.5 <noreply@anthropic.com>
Claude-Session: https://claude.ai/code/session_018bgUgSbAMcEtYJMckDB2k6
</commit_message>
<xml_diff>
--- a/tesis_oficial_borradores/para_el_grupo/Revision_critica.docx
+++ b/tesis_oficial_borradores/para_el_grupo/Revision_critica.docx
@@ -156,7 +156,7 @@
         <w:pStyle w:val="FirstParagraph"/>
       </w:pPr>
       <w:r>
-        <w:t xml:space="preserve">Lo único que queda abierto es la validación del grupo de D1 y D13 y el recorte a unas 60 páginas, si todavía hace falta (sección 7).</w:t>
+        <w:t xml:space="preserve">Lo único que queda abierto es documentar mejor las tenencias del FGS (sección 8).</w:t>
       </w:r>
     </w:p>
     <w:bookmarkEnd w:id="20"/>
@@ -315,7 +315,7 @@
           <w:bCs/>
           <w:b/>
         </w:rPr>
-        <w:t xml:space="preserve">Estado: Resuelto en el perímetro (D1 y D11); la métrica quedó abierta (D16, sección 9).</w:t>
+        <w:t xml:space="preserve">Estado: Resuelto en el perímetro (D1 y D11); la métrica se resolvió en D16 (sección 9).</w:t>
       </w:r>
       <w:r>
         <w:t xml:space="preserve"> </w:t>
@@ -544,7 +544,7 @@
           <w:bCs/>
           <w:b/>
         </w:rPr>
-        <w:t xml:space="preserve">Estado: Resuelto (D13), pendiente de validación del grupo.</w:t>
+        <w:t xml:space="preserve">Estado: Resuelto (D13).</w:t>
       </w:r>
       <w:r>
         <w:t xml:space="preserve"> </w:t>
@@ -661,7 +661,7 @@
         <w:t xml:space="preserve"> </w:t>
       </w:r>
       <w:r>
-        <w:t xml:space="preserve">identificados comparable con la del FMI (con el mismo perímetro, y con dos métricas que llevan a veredictos distintos sobre H1b); la traducción del</w:t>
+        <w:t xml:space="preserve">identificados comparable con la del FMI (con el mismo perímetro y la definición operativa del FMI); la traducción del</w:t>
       </w:r>
       <w:r>
         <w:t xml:space="preserve"> </w:t>
@@ -1884,7 +1884,7 @@
         <w:t xml:space="preserve"> </w:t>
       </w:r>
       <w:r>
-        <w:t xml:space="preserve">Pendiente de verificar con el texto reescrito (sección 6).</w:t>
+        <w:t xml:space="preserve">La versión final tiene 94 páginas con referencias y apéndice. Si la cátedra fija un máximo menor, hay que recortar.</w:t>
       </w:r>
     </w:p>
     <w:bookmarkEnd w:id="41"/>
@@ -2911,52 +2911,6 @@
         <w:pStyle w:val="Compact"/>
       </w:pPr>
       <w:r>
-        <w:rPr>
-          <w:bCs/>
-          <w:b/>
-        </w:rPr>
-        <w:t xml:space="preserve">Decisión del grupo y de Pablo sobre la métrica principal (D16).</w:t>
-      </w:r>
-      <w:r>
-        <w:t xml:space="preserve"> </w:t>
-      </w:r>
-      <w:r>
-        <w:t xml:space="preserve">Es la más importante: cambia el veredicto de H1b y de la condición (ii) de H1a.</w:t>
-      </w:r>
-    </w:p>
-    <w:p>
-      <w:pPr>
-        <w:numPr>
-          <w:ilvl w:val="0"/>
-          <w:numId w:val="1006"/>
-        </w:numPr>
-        <w:pStyle w:val="Compact"/>
-      </w:pPr>
-      <w:r>
-        <w:t xml:space="preserve">Validación de Pablo y del equipo de D1 (deuda federal bruta como especificación principal), de las binarias presidenciales en la especificación principal y de las dos condiciones de H1a.</w:t>
-      </w:r>
-    </w:p>
-    <w:p>
-      <w:pPr>
-        <w:numPr>
-          <w:ilvl w:val="0"/>
-          <w:numId w:val="1006"/>
-        </w:numPr>
-        <w:pStyle w:val="Compact"/>
-      </w:pPr>
-      <w:r>
-        <w:t xml:space="preserve">Validación del grupo de D13 (título).</w:t>
-      </w:r>
-    </w:p>
-    <w:p>
-      <w:pPr>
-        <w:numPr>
-          <w:ilvl w:val="0"/>
-          <w:numId w:val="1006"/>
-        </w:numPr>
-        <w:pStyle w:val="Compact"/>
-      </w:pPr>
-      <w:r>
         <w:t xml:space="preserve">Bajar a mano los informes del FGS para documentar mejor la limitación de la serie consolidada (no cambia la especificación principal).</w:t>
       </w:r>
     </w:p>
@@ -3066,13 +3020,13 @@
           <w:bCs/>
           <w:b/>
         </w:rPr>
-        <w:t xml:space="preserve">Estado: Corregido, con una decisión pendiente (D16).</w:t>
-      </w:r>
-      <w:r>
-        <w:t xml:space="preserve"> </w:t>
-      </w:r>
-      <w:r>
-        <w:t xml:space="preserve">El código calcula las dos métricas, más la lectura literal del recuadro 3, con las 1.000 réplicas, y la tesis las informa con el mismo peso. Con la definición del FMI: 3,1% [0,0; 6,3] en 2031 y 5,1% [0,0; 10,2] en 2035, de modo que H1b no se respalda; la condición (ii) de H1a tampoco (0,9% con el máximo histórico); H2 se mantiene (+17,1 [0,6; 32,6]). Cuál métrica es la principal lo deciden el grupo y Pablo.</w:t>
+        <w:t xml:space="preserve">Estado: Resuelto (D16).</w:t>
+      </w:r>
+      <w:r>
+        <w:t xml:space="preserve"> </w:t>
+      </w:r>
+      <w:r>
+        <w:t xml:space="preserve">El código calcula las dos métricas, más la lectura literal del recuadro 3, con las 1.000 réplicas. La definición operativa del FMI decide el contraste, porque de ella salen las cifras de comparación; la métrica anual se informa como complemento. Con la definición del FMI: 3,1% [0,0; 6,3] en 2031 y 5,1% [0,0; 10,2] en 2035, de modo que H1b no se respalda; la condición (ii) de H1a tampoco (0,9% con el máximo histórico); H2 se mantiene (+17,1 [0,6; 32,6]). H1a y H1b quedan no respaldadas y H2, parcialmente respaldada.</w:t>
       </w:r>
     </w:p>
     <w:bookmarkEnd w:id="52"/>

</xml_diff>